<commit_message>
Use Eton instead of Birley in file names, titles, headers and guides; Birley 12 -> Birley Schools
Old "AP ..." addresses still redirect, now to the Eton pages.
Update hashes and the Olly guide PDF refreshed.

Co-Authored-By: Claude Sonnet 5.5 <noreply@anthropic.com>
Claude-Session: https://claude.ai/code/session_01PtLNqJ6dBkTLNoYddvJHKa
</commit_message>
<xml_diff>
--- a/Word documents/Eton_A_Level_User_Guide.docx
+++ b/Word documents/Eton_A_Level_User_Guide.docx
@@ -4884,7 +4884,7 @@
           <w:sz w:val="22"/>
           <w:szCs w:val="22"/>
         </w:rPr>
-        <w:t xml:space="preserve"> (use this in Birley 12, or when AP has set the test as an EW) or </w:t>
+        <w:t xml:space="preserve"> (use this in Birley Schools, or when AP has set the test as an EW) or </w:t>
       </w:r>
       <w:r>
         <w:rPr>
@@ -5280,7 +5280,7 @@
           <w:sz w:val="22"/>
           <w:szCs w:val="22"/>
         </w:rPr>
-        <w:t xml:space="preserve"> box. This is the most important part: what caught you out, and how will you remember it? In Birley 12 you get a couple of minutes; in your House take as long as you need. The PDF button unlocks only after you have written for 30 seconds.</w:t>
+        <w:t xml:space="preserve"> box. This is the most important part: what caught you out, and how will you remember it? In Birley Schools you get a couple of minutes; in your House take as long as you need. The PDF button unlocks only after you have written for 30 seconds.</w:t>
       </w:r>
     </w:p>
     <w:p>
@@ -6086,7 +6086,7 @@
           <w:sz w:val="22"/>
           <w:szCs w:val="22"/>
         </w:rPr>
-        <w:t xml:space="preserve"> (work done in Birley 12) or </w:t>
+        <w:t xml:space="preserve"> (work done in Birley Schools) or </w:t>
       </w:r>
       <w:r>
         <w:rPr>
@@ -8431,7 +8431,7 @@
           <w:sz w:val="22"/>
           <w:szCs w:val="22"/>
         </w:rPr>
-        <w:t xml:space="preserve"> in Birley 12. Your questions may differ from your neighbour's. Between them, the practice tests cover the whole selection AP chose, and the ACTUAL TEST is a fresh random draw from all of it, so learning just one practice test will not be enough.</w:t>
+        <w:t xml:space="preserve"> in Birley Schools. Your questions may differ from your neighbour's. Between them, the practice tests cover the whole selection AP chose, and the ACTUAL TEST is a fresh random draw from all of it, so learning just one practice test will not be enough.</w:t>
       </w:r>
     </w:p>
     <w:p>

</xml_diff>

<commit_message>
VVs Drill: split Vocab Set into Topic Vocab (TV), Verb Structures (VS) and combined (VV)
Structure items are flagged in VV_DATA; TV/VS sets are derived at load.
View & Print and Speed Challenge list the same three groups. Guides updated.

Co-Authored-By: Claude Sonnet 5.5 <noreply@anthropic.com>
Claude-Session: https://claude.ai/code/session_01K5evm9ar1NPyE4AyaxCYwB
</commit_message>
<xml_diff>
--- a/Word documents/Eton_A_Level_User_Guide.docx
+++ b/Word documents/Eton_A_Level_User_Guide.docx
@@ -91,7 +91,7 @@
           <w:sz w:val="20"/>
           <w:szCs w:val="20"/>
         </w:rPr>
-        <w:t xml:space="preserve">Updated 12 October 2026 to match the latest versions of the apps.</w:t>
+        <w:t>Updated 15 October 2026 to match the latest versions of the apps.</w:t>
       </w:r>
     </w:p>
     <w:p>
@@ -18170,87 +18170,115 @@
           <w:sz w:val="22"/>
           <w:szCs w:val="22"/>
         </w:rPr>
-        <w:t xml:space="preserve">Vocab Set:</w:t>
-      </w:r>
-      <w:r>
-        <w:rPr>
-          <w:rFonts w:ascii="Arial" w:cs="Arial" w:eastAsia="Arial" w:hAnsi="Arial"/>
-          <w:sz w:val="22"/>
-          <w:szCs w:val="22"/>
-        </w:rPr>
-        <w:t xml:space="preserve"> </w:t>
-      </w:r>
-      <w:r>
-        <w:rPr>
-          <w:rFonts w:ascii="Arial" w:cs="Arial" w:eastAsia="Arial" w:hAnsi="Arial"/>
-          <w:b/>
-          <w:bCs/>
-          <w:sz w:val="22"/>
-          <w:szCs w:val="22"/>
-        </w:rPr>
-        <w:t xml:space="preserve">Michaelmas Trials</w:t>
-      </w:r>
-      <w:r>
-        <w:rPr>
-          <w:rFonts w:ascii="Arial" w:cs="Arial" w:eastAsia="Arial" w:hAnsi="Arial"/>
-          <w:sz w:val="22"/>
-          <w:szCs w:val="22"/>
-        </w:rPr>
-        <w:t xml:space="preserve">, </w:t>
-      </w:r>
-      <w:r>
-        <w:rPr>
-          <w:rFonts w:ascii="Arial" w:cs="Arial" w:eastAsia="Arial" w:hAnsi="Arial"/>
-          <w:b/>
-          <w:bCs/>
-          <w:sz w:val="22"/>
-          <w:szCs w:val="22"/>
-        </w:rPr>
-        <w:t xml:space="preserve">Summer Trials</w:t>
-      </w:r>
-      <w:r>
-        <w:rPr>
-          <w:rFonts w:ascii="Arial" w:cs="Arial" w:eastAsia="Arial" w:hAnsi="Arial"/>
-          <w:sz w:val="22"/>
-          <w:szCs w:val="22"/>
-        </w:rPr>
-        <w:t xml:space="preserve">, then </w:t>
-      </w:r>
-      <w:r>
-        <w:rPr>
-          <w:rFonts w:ascii="Arial" w:cs="Arial" w:eastAsia="Arial" w:hAnsi="Arial"/>
-          <w:b/>
-          <w:bCs/>
-          <w:sz w:val="22"/>
-          <w:szCs w:val="22"/>
-        </w:rPr>
-        <w:t xml:space="preserve">VV1a, VV1b, VV1c, VV1 Entire</w:t>
-      </w:r>
-      <w:r>
-        <w:rPr>
-          <w:rFonts w:ascii="Arial" w:cs="Arial" w:eastAsia="Arial" w:hAnsi="Arial"/>
-          <w:sz w:val="22"/>
-          <w:szCs w:val="22"/>
-        </w:rPr>
-        <w:t xml:space="preserve"> up to </w:t>
-      </w:r>
-      <w:r>
-        <w:rPr>
-          <w:rFonts w:ascii="Arial" w:cs="Arial" w:eastAsia="Arial" w:hAnsi="Arial"/>
-          <w:b/>
-          <w:bCs/>
-          <w:sz w:val="22"/>
-          <w:szCs w:val="22"/>
-        </w:rPr>
-        <w:t xml:space="preserve">VV12 Entire</w:t>
-      </w:r>
-      <w:r>
-        <w:rPr>
-          <w:rFonts w:ascii="Arial" w:cs="Arial" w:eastAsia="Arial" w:hAnsi="Arial"/>
-          <w:sz w:val="22"/>
-          <w:szCs w:val="22"/>
-        </w:rPr>
-        <w:t xml:space="preserve"> (50 sets). VV1 to VV12 line up with Topics 1 to 12.</w:t>
+        <w:t>Vocab Set:</w:t>
+      </w:r>
+      <w:r>
+        <w:rPr>
+          <w:rFonts w:ascii="Arial" w:cs="Arial" w:eastAsia="Arial" w:hAnsi="Arial"/>
+          <w:sz w:val="22"/>
+          <w:szCs w:val="22"/>
+        </w:rPr>
+        <w:t xml:space="preserve"> choose from three groups. </w:t>
+      </w:r>
+      <w:r>
+        <w:rPr>
+          <w:rFonts w:ascii="Arial" w:cs="Arial" w:eastAsia="Arial" w:hAnsi="Arial"/>
+          <w:b/>
+          <w:bCs/>
+          <w:sz w:val="22"/>
+          <w:szCs w:val="22"/>
+        </w:rPr>
+        <w:t>Topic Vocabulary (TV):</w:t>
+      </w:r>
+      <w:r>
+        <w:rPr>
+          <w:rFonts w:ascii="Arial" w:cs="Arial" w:eastAsia="Arial" w:hAnsi="Arial"/>
+          <w:sz w:val="22"/>
+          <w:szCs w:val="22"/>
+        </w:rPr>
+        <w:t xml:space="preserve"> TV1a, TV1b, TV1c, TV1 Entire up to TV12 Entire (48 sets), the topic vocabulary only. </w:t>
+      </w:r>
+      <w:r>
+        <w:rPr>
+          <w:rFonts w:ascii="Arial" w:cs="Arial" w:eastAsia="Arial" w:hAnsi="Arial"/>
+          <w:b/>
+          <w:bCs/>
+          <w:sz w:val="22"/>
+          <w:szCs w:val="22"/>
+        </w:rPr>
+        <w:t>Verb Structures (VS):</w:t>
+      </w:r>
+      <w:r>
+        <w:rPr>
+          <w:rFonts w:ascii="Arial" w:cs="Arial" w:eastAsia="Arial" w:hAnsi="Arial"/>
+          <w:sz w:val="22"/>
+          <w:szCs w:val="22"/>
+        </w:rPr>
+        <w:t xml:space="preserve"> VS1a, VS1b, VS1c, VS1 Entire up to VS12 Entire (48 sets), the verb structures only, in alphabetical order. </w:t>
+      </w:r>
+      <w:r>
+        <w:rPr>
+          <w:rFonts w:ascii="Arial" w:cs="Arial" w:eastAsia="Arial" w:hAnsi="Arial"/>
+          <w:b/>
+          <w:bCs/>
+          <w:sz w:val="22"/>
+          <w:szCs w:val="22"/>
+        </w:rPr>
+        <w:t>Combined (VV):</w:t>
+      </w:r>
+      <w:r>
+        <w:rPr>
+          <w:rFonts w:ascii="Arial" w:cs="Arial" w:eastAsia="Arial" w:hAnsi="Arial"/>
+          <w:sz w:val="22"/>
+          <w:szCs w:val="22"/>
+        </w:rPr>
+        <w:t xml:space="preserve"> Michaelmas Trials, Summer Trials, then VV1a, VV1b, VV1c, VV1 Entire up to VV12 Entire (50 sets), topic vocabulary and verb structures together. TV1 to TV12, VS1 to VS12 and VV1 to VV12 all line up with Topics 1 to 12.</w:t>
+      </w:r>
+    </w:p>
+    <w:p>
+      <w:pPr>
+        <w:pStyle w:val="ListParagraph"/>
+        <w:numPr>
+          <w:ilvl w:val="0"/>
+          <w:numId w:val="2"/>
+        </w:numPr>
+        <w:spacing w:after="60" w:line="276"/>
+      </w:pPr>
+      <w:r>
+        <w:rPr>
+          <w:rFonts w:ascii="Arial" w:cs="Arial" w:eastAsia="Arial" w:hAnsi="Arial"/>
+          <w:b/>
+          <w:bCs/>
+          <w:sz w:val="22"/>
+          <w:szCs w:val="22"/>
+        </w:rPr>
+        <w:t>TV1a</w:t>
+      </w:r>
+      <w:r>
+        <w:rPr>
+          <w:rFonts w:ascii="Arial" w:cs="Arial" w:eastAsia="Arial" w:hAnsi="Arial"/>
+          <w:sz w:val="22"/>
+          <w:szCs w:val="22"/>
+        </w:rPr>
+        <w:t xml:space="preserve"> is the topic vocabulary of VV1a and </w:t>
+      </w:r>
+      <w:r>
+        <w:rPr>
+          <w:rFonts w:ascii="Arial" w:cs="Arial" w:eastAsia="Arial" w:hAnsi="Arial"/>
+          <w:b/>
+          <w:bCs/>
+          <w:sz w:val="22"/>
+          <w:szCs w:val="22"/>
+        </w:rPr>
+        <w:t>VS1a</w:t>
+      </w:r>
+      <w:r>
+        <w:rPr>
+          <w:rFonts w:ascii="Arial" w:cs="Arial" w:eastAsia="Arial" w:hAnsi="Arial"/>
+          <w:sz w:val="22"/>
+          <w:szCs w:val="22"/>
+        </w:rPr>
+        <w:t xml:space="preserve"> is its verb structures, so TV1a and VS1a together make VV1a (the same goes for every set). Your teacher will tell you which sets to learn. 📖 View &amp; Print and the ⚡ Speed Challenge list the same three groups.</w:t>
       </w:r>
     </w:p>
     <w:p>

</xml_diff>

<commit_message>
VVs Drill: three labelled rows, each with its own dropdown (Topic Vocab Only, Verb Structures Only, Vocab and Verbs together); guides; restamped
Co-Authored-By: Claude Sonnet 5.5 <noreply@anthropic.com>
Claude-Session: https://claude.ai/code/session_01S5rYTdm2Guhk5rucFAEyLg
</commit_message>
<xml_diff>
--- a/Word documents/Eton_A_Level_User_Guide.docx
+++ b/Word documents/Eton_A_Level_User_Guide.docx
@@ -18170,69 +18170,7 @@
           <w:sz w:val="22"/>
           <w:szCs w:val="22"/>
         </w:rPr>
-        <w:t>Vocab Set:</w:t>
-      </w:r>
-      <w:r>
-        <w:rPr>
-          <w:rFonts w:ascii="Arial" w:cs="Arial" w:eastAsia="Arial" w:hAnsi="Arial"/>
-          <w:sz w:val="22"/>
-          <w:szCs w:val="22"/>
-        </w:rPr>
-        <w:t xml:space="preserve"> choose from three groups. </w:t>
-      </w:r>
-      <w:r>
-        <w:rPr>
-          <w:rFonts w:ascii="Arial" w:cs="Arial" w:eastAsia="Arial" w:hAnsi="Arial"/>
-          <w:b/>
-          <w:bCs/>
-          <w:sz w:val="22"/>
-          <w:szCs w:val="22"/>
-        </w:rPr>
-        <w:t>Topic Vocabulary (TV):</w:t>
-      </w:r>
-      <w:r>
-        <w:rPr>
-          <w:rFonts w:ascii="Arial" w:cs="Arial" w:eastAsia="Arial" w:hAnsi="Arial"/>
-          <w:sz w:val="22"/>
-          <w:szCs w:val="22"/>
-        </w:rPr>
-        <w:t xml:space="preserve"> TV1a, TV1b, TV1c, TV1 Entire up to TV12 Entire (48 sets), the topic vocabulary only. </w:t>
-      </w:r>
-      <w:r>
-        <w:rPr>
-          <w:rFonts w:ascii="Arial" w:cs="Arial" w:eastAsia="Arial" w:hAnsi="Arial"/>
-          <w:b/>
-          <w:bCs/>
-          <w:sz w:val="22"/>
-          <w:szCs w:val="22"/>
-        </w:rPr>
-        <w:t>Verb Structures (VS):</w:t>
-      </w:r>
-      <w:r>
-        <w:rPr>
-          <w:rFonts w:ascii="Arial" w:cs="Arial" w:eastAsia="Arial" w:hAnsi="Arial"/>
-          <w:sz w:val="22"/>
-          <w:szCs w:val="22"/>
-        </w:rPr>
-        <w:t xml:space="preserve"> VS1a, VS1b, VS1c, VS1 Entire up to VS12 Entire (48 sets), the verb structures only, in alphabetical order. </w:t>
-      </w:r>
-      <w:r>
-        <w:rPr>
-          <w:rFonts w:ascii="Arial" w:cs="Arial" w:eastAsia="Arial" w:hAnsi="Arial"/>
-          <w:b/>
-          <w:bCs/>
-          <w:sz w:val="22"/>
-          <w:szCs w:val="22"/>
-        </w:rPr>
-        <w:t>Combined (VV):</w:t>
-      </w:r>
-      <w:r>
-        <w:rPr>
-          <w:rFonts w:ascii="Arial" w:cs="Arial" w:eastAsia="Arial" w:hAnsi="Arial"/>
-          <w:sz w:val="22"/>
-          <w:szCs w:val="22"/>
-        </w:rPr>
-        <w:t xml:space="preserve"> Michaelmas Trials, Summer Trials, then VV1a, VV1b, VV1c, VV1 Entire up to VV12 Entire (50 sets), topic vocabulary and verb structures together. TV1 to TV12, VS1 to VS12 and VV1 to VV12 all line up with Topics 1 to 12.</w:t>
+        <w:t>What to practise: three labelled rows, each with its own dropdown. Topic Vocab Only (TV1a, TV1b, TV1c, TV1 Entire up to TV12 Entire) is the topic vocabulary only. Verb Structures Only (VS1a up to VS12 Entire) is the verb structures only, in alphabetical order. Vocab and Verbs together (Michaelmas Trials, Summer Trials, then VV1a up to VV12 Entire) is both. Press a row's button, or change its dropdown, to choose; the highlighted row is the one used, and the number of phrases is shown beside each. TV1 to TV12, VS1 to VS12 and VV1 to VV12 all line up with Topics 1 to 12.</w:t>
       </w:r>
     </w:p>
     <w:p>

</xml_diff>

<commit_message>
Timed tests: tap the clock to make it smaller (still visible)
The test clock can be minimised to a small, calm pill (no pulsing) and
restored by tapping it again (or Enter/Space). Remembered on the device.
Guides (A Level, IGCSE, F Spanish, Olly: HTML, Word, PDF) updated.

Co-Authored-By: Claude Sonnet 5.5 <noreply@anthropic.com>
Claude-Session: https://claude.ai/code/session_01K5evm9ar1NPyE4AyaxCYwB
</commit_message>
<xml_diff>
--- a/Word documents/Eton_A_Level_User_Guide.docx
+++ b/Word documents/Eton_A_Level_User_Guide.docx
@@ -91,7 +91,7 @@
           <w:sz w:val="20"/>
           <w:szCs w:val="20"/>
         </w:rPr>
-        <w:t>Updated 15 October 2026 to match the latest versions of the apps.</w:t>
+        <w:t>Updated 16 October 2026 to match the latest versions of the apps.</w:t>
       </w:r>
     </w:p>
     <w:p>
@@ -4902,7 +4902,7 @@
           <w:sz w:val="22"/>
           <w:szCs w:val="22"/>
         </w:rPr>
-        <w:t xml:space="preserve">. You cannot change your mind once you start. The clock starts the moment you tap and cannot be paused. Blank answers score 0.</w:t>
+        <w:t>. You cannot change your mind once you start. The clock starts the moment you tap and cannot be paused. If the clock at the top of the screen distracts you, tap it to make it smaller (tap again to make it bigger); it stays on screen. Blank answers score 0.</w:t>
       </w:r>
     </w:p>
     <w:p>

</xml_diff>

<commit_message>
Rename: Eton Structures -> Top Structures; Eton Oral Cycle -> A Level Oral Cycle; Eton Tests page -> AP Tests
Visible names only: file names and links are unchanged. Build ids refreshed;
guides (HTML, Word, Olly PDF) updated to match.

Co-Authored-By: Claude Sonnet 5.5 <noreply@anthropic.com>
Claude-Session: https://claude.ai/code/session_01K5evm9ar1NPyE4AyaxCYwB
</commit_message>
<xml_diff>
--- a/Word documents/Eton_A_Level_User_Guide.docx
+++ b/Word documents/Eton_A_Level_User_Guide.docx
@@ -499,7 +499,7 @@
                   <w:szCs w:val="20"/>
                   <w:u w:val="single"/>
                 </w:rPr>
-                <w:t xml:space="preserve">Eton Tests (set tests)</w:t>
+                <w:t xml:space="preserve">AP Tests (set tests)</w:t>
               </w:r>
             </w:hyperlink>
           </w:p>
@@ -1249,7 +1249,7 @@
           <w:sz w:val="22"/>
           <w:szCs w:val="22"/>
         </w:rPr>
-        <w:t xml:space="preserve">The Eton Tests page and the set tests need an internet connection. Pages that only drill are happy once they have loaded.</w:t>
+        <w:t xml:space="preserve">The AP Tests page and the set tests need an internet connection. Pages that only drill are happy once they have loaded.</w:t>
       </w:r>
     </w:p>
     <w:p>
@@ -7358,7 +7358,7 @@
           <w:sz w:val="22"/>
           <w:szCs w:val="22"/>
         </w:rPr>
-        <w:t xml:space="preserve"> button at the foot of the Eton Tests page.</w:t>
+        <w:t xml:space="preserve"> button at the foot of the AP Tests page.</w:t>
       </w:r>
     </w:p>
     <w:p>
@@ -7379,7 +7379,7 @@
           <w:sz w:val="36"/>
           <w:szCs w:val="36"/>
         </w:rPr>
-        <w:t xml:space="preserve">Part 2. Tests set by your teacher (Eton Tests)</w:t>
+        <w:t xml:space="preserve">Part 2. Tests set by your teacher (AP Tests)</w:t>
       </w:r>
     </w:p>
     <w:p>
@@ -7398,7 +7398,7 @@
             <w:szCs w:val="24"/>
             <w:u w:val="single"/>
           </w:rPr>
-          <w:t xml:space="preserve">▶ Open Eton Tests</w:t>
+          <w:t xml:space="preserve">▶ Open AP Tests</w:t>
         </w:r>
       </w:hyperlink>
       <w:r>
@@ -7559,7 +7559,7 @@
           <w:sz w:val="22"/>
           <w:szCs w:val="22"/>
         </w:rPr>
-        <w:t xml:space="preserve">Eton Tests</w:t>
+        <w:t xml:space="preserve">AP Tests</w:t>
       </w:r>
       <w:r>
         <w:rPr>
@@ -9978,7 +9978,7 @@
                 <w:sz w:val="20"/>
                 <w:szCs w:val="20"/>
               </w:rPr>
-              <w:t xml:space="preserve">Eton Oral Cycle Practice</w:t>
+              <w:t xml:space="preserve">A Level Oral Cycle Practice</w:t>
             </w:r>
           </w:p>
         </w:tc>
@@ -16038,7 +16038,7 @@
           <w:sz w:val="24"/>
           <w:szCs w:val="24"/>
         </w:rPr>
-        <w:t xml:space="preserve">E. Eton Oral Cycle Practice</w:t>
+        <w:t xml:space="preserve">E. A Level Oral Cycle Practice</w:t>
       </w:r>
     </w:p>
     <w:p>
@@ -20715,7 +20715,7 @@
                 <w:sz w:val="20"/>
                 <w:szCs w:val="20"/>
               </w:rPr>
-              <w:t xml:space="preserve">Eton Oral Cycle</w:t>
+              <w:t xml:space="preserve">A Level Oral Cycle</w:t>
             </w:r>
           </w:p>
         </w:tc>

</xml_diff>

<commit_message>
Self-set tests: after marking, a boy can take a fresh test (new questions, same settings); guides updated
Co-Authored-By: Claude Sonnet 5.5 <noreply@anthropic.com>
Claude-Session: https://claude.ai/code/session_012RK9SM6GcbZD26X2uX1pzz
</commit_message>
<xml_diff>
--- a/Word documents/Eton_A_Level_User_Guide.docx
+++ b/Word documents/Eton_A_Level_User_Guide.docx
@@ -5498,6 +5498,24 @@
           <w:szCs w:val="22"/>
         </w:rPr>
         <w:t xml:space="preserve"> option.</w:t>
+      </w:r>
+    </w:p>
+    <w:p>
+      <w:pPr>
+        <w:pStyle w:val="ListParagraph"/>
+        <w:numPr>
+          <w:ilvl w:val="0"/>
+          <w:numId w:val="2"/>
+        </w:numPr>
+        <w:spacing w:after="60" w:line="276"/>
+      </w:pPr>
+      <w:r>
+        <w:rPr>
+          <w:rFonts w:ascii="Arial" w:cs="Arial" w:eastAsia="Arial" w:hAnsi="Arial"/>
+          <w:sz w:val="22"/>
+          <w:szCs w:val="22"/>
+        </w:rPr>
+        <w:t xml:space="preserve">When you have finished, marked and saved your PDF, you can press 🔄 Take a fresh test at the bottom of the page for new questions with the same settings. The test you have just done is cleared, so save its PDF first. Teacher-set tests do not have this button.</w:t>
       </w:r>
     </w:p>
     <w:p>

</xml_diff>

<commit_message>
VS tiers: Essential / Important / Recognition for the A Level verb structures
Each weekly set now has five Essential and five Important verb structures; the rest are
Recognition (French to English only). New derived sets VSE, VSI, VSEI (Essential + Important)
and VSR sit beside VS in the VVs Drill (tier buttons), Leisure Mode, Generate Test, View & Print
and the Speed Challenge picker. Guides updated (A Level, Olly).

Co-Authored-By: Claude Sonnet 5.5 <noreply@anthropic.com>
Claude-Session: https://claude.ai/code/session_01PyR4m9qw3VZiECsMbL7sBu
</commit_message>
<xml_diff>
--- a/Word documents/Eton_A_Level_User_Guide.docx
+++ b/Word documents/Eton_A_Level_User_Guide.docx
@@ -18189,6 +18189,35 @@
           <w:szCs w:val="22"/>
         </w:rPr>
         <w:t>What to practise: three labelled rows, each with its own dropdown. Topic Vocab Only (TV1a, TV1b, TV1c, TV1 Entire up to TV12 Entire) is the topic vocabulary only. Verb Structures Only (VS1a up to VS12 Entire) is the verb structures only, in alphabetical order. Vocab and Verbs together (Michaelmas Trials, Summer Trials, then VV1a up to VV12 Entire) is both. Press a row's button, or change its dropdown, to choose; the highlighted row is the one used, and the number of phrases is shown beside each. TV1 to TV12, VS1 to VS12 and VV1 to VV12 all line up with Topics 1 to 12.</w:t>
+      </w:r>
+    </w:p>
+    <w:p>
+      <w:pPr>
+        <w:pStyle w:val="ListParagraph"/>
+        <w:numPr>
+          <w:ilvl w:val="0"/>
+          <w:numId w:val="2"/>
+        </w:numPr>
+        <w:spacing w:after="60" w:line="276"/>
+      </w:pPr>
+      <w:r>
+        <w:rPr>
+          <w:rFonts w:ascii="Arial" w:cs="Arial" w:eastAsia="Arial" w:hAnsi="Arial"/>
+          <w:b/>
+          <w:bCs/>
+          <w:sz w:val="22"/>
+          <w:szCs w:val="22"/>
+        </w:rPr>
+        <w:t xml:space="preserve">Which structures: </w:t>
+      </w:r>
+      <w:r>
+        <w:rPr>
+          <w:rFonts w:ascii="Arial" w:cs="Arial" w:eastAsia="Arial" w:hAnsi="Arial"/>
+          <w:bCs/>
+          <w:sz w:val="22"/>
+          <w:szCs w:val="22"/>
+        </w:rPr>
+        <w:t>five buttons under Verb Structures Only choose how many of the verb structures to practise. Essential are the five most important structures of each week: learn them and be able to write them in French. Important are the next five. Essential + Important gives you both together, ten a week. Recognition are all the others: you only need to understand them, so they are practised French to English only. All structures is every verb structure of the week, as before. The sets are named to match, for example VS Essential 3b or VS Recognition 3b, and 📖 View &amp; Print and the ⚡ Speed Challenge list them too. The same structure can appear in more than one week; it counts as Essential or Important only in the week where it is marked.</w:t>
       </w:r>
     </w:p>
     <w:p>

</xml_diff>

<commit_message>
View & Print: Group by (Set/Topic/Tier/One list), Sort (original/A-Z), tier badges, Select all
A printed list of all the verb structures can now be grouped by tier, topic or set, or as one list,
sorted original or A-Z; each verb structure shows E / I / R; each group heading has Select all.
A Level guide updated.

Co-Authored-By: Claude Sonnet 5.5 <noreply@anthropic.com>
Claude-Session: https://claude.ai/code/session_01PyR4m9qw3VZiECsMbL7sBu
</commit_message>
<xml_diff>
--- a/Word documents/Eton_A_Level_User_Guide.docx
+++ b/Word documents/Eton_A_Level_User_Guide.docx
@@ -18536,6 +18536,116 @@
           <w:szCs w:val="22"/>
         </w:rPr>
         <w:t xml:space="preserve">.</w:t>
+      </w:r>
+      <w:r>
+        <w:rPr>
+          <w:rFonts w:ascii="Arial" w:cs="Arial" w:eastAsia="Arial" w:hAnsi="Arial"/>
+          <w:sz w:val="22"/>
+          <w:szCs w:val="22"/>
+        </w:rPr>
+        <w:t xml:space="preserve"> </w:t>
+      </w:r>
+      <w:r>
+        <w:rPr>
+          <w:rFonts w:ascii="Arial" w:cs="Arial" w:eastAsia="Arial" w:hAnsi="Arial"/>
+          <w:b/>
+          <w:sz w:val="22"/>
+          <w:szCs w:val="22"/>
+        </w:rPr>
+        <w:t>Group by</w:t>
+      </w:r>
+      <w:r>
+        <w:rPr>
+          <w:rFonts w:ascii="Arial" w:cs="Arial" w:eastAsia="Arial" w:hAnsi="Arial"/>
+          <w:sz w:val="22"/>
+          <w:szCs w:val="22"/>
+        </w:rPr>
+        <w:t xml:space="preserve"> (Set, Topic, Tier or One list) and </w:t>
+      </w:r>
+      <w:r>
+        <w:rPr>
+          <w:rFonts w:ascii="Arial" w:cs="Arial" w:eastAsia="Arial" w:hAnsi="Arial"/>
+          <w:b/>
+          <w:sz w:val="22"/>
+          <w:szCs w:val="22"/>
+        </w:rPr>
+        <w:t>Sort</w:t>
+      </w:r>
+      <w:r>
+        <w:rPr>
+          <w:rFonts w:ascii="Arial" w:cs="Arial" w:eastAsia="Arial" w:hAnsi="Arial"/>
+          <w:sz w:val="22"/>
+          <w:szCs w:val="22"/>
+        </w:rPr>
+        <w:t xml:space="preserve"> (Original order or A–Z) decide how the list is arranged on screen and on every printout, so you can print all the verb structures together, grouped by Essential, Important and Recognition. A </w:t>
+      </w:r>
+      <w:r>
+        <w:rPr>
+          <w:rFonts w:ascii="Arial" w:cs="Arial" w:eastAsia="Arial" w:hAnsi="Arial"/>
+          <w:b/>
+          <w:sz w:val="22"/>
+          <w:szCs w:val="22"/>
+        </w:rPr>
+        <w:t>Select all</w:t>
+      </w:r>
+      <w:r>
+        <w:rPr>
+          <w:rFonts w:ascii="Arial" w:cs="Arial" w:eastAsia="Arial" w:hAnsi="Arial"/>
+          <w:sz w:val="22"/>
+          <w:szCs w:val="22"/>
+        </w:rPr>
+        <w:t xml:space="preserve"> button on each group heading ticks every set in it, and a small </w:t>
+      </w:r>
+      <w:r>
+        <w:rPr>
+          <w:rFonts w:ascii="Arial" w:cs="Arial" w:eastAsia="Arial" w:hAnsi="Arial"/>
+          <w:b/>
+          <w:sz w:val="22"/>
+          <w:szCs w:val="22"/>
+        </w:rPr>
+        <w:t>E</w:t>
+      </w:r>
+      <w:r>
+        <w:rPr>
+          <w:rFonts w:ascii="Arial" w:cs="Arial" w:eastAsia="Arial" w:hAnsi="Arial"/>
+          <w:sz w:val="22"/>
+          <w:szCs w:val="22"/>
+        </w:rPr>
+        <w:t xml:space="preserve">, </w:t>
+      </w:r>
+      <w:r>
+        <w:rPr>
+          <w:rFonts w:ascii="Arial" w:cs="Arial" w:eastAsia="Arial" w:hAnsi="Arial"/>
+          <w:b/>
+          <w:sz w:val="22"/>
+          <w:szCs w:val="22"/>
+        </w:rPr>
+        <w:t>I</w:t>
+      </w:r>
+      <w:r>
+        <w:rPr>
+          <w:rFonts w:ascii="Arial" w:cs="Arial" w:eastAsia="Arial" w:hAnsi="Arial"/>
+          <w:sz w:val="22"/>
+          <w:szCs w:val="22"/>
+        </w:rPr>
+        <w:t xml:space="preserve"> or </w:t>
+      </w:r>
+      <w:r>
+        <w:rPr>
+          <w:rFonts w:ascii="Arial" w:cs="Arial" w:eastAsia="Arial" w:hAnsi="Arial"/>
+          <w:b/>
+          <w:sz w:val="22"/>
+          <w:szCs w:val="22"/>
+        </w:rPr>
+        <w:t>R</w:t>
+      </w:r>
+      <w:r>
+        <w:rPr>
+          <w:rFonts w:ascii="Arial" w:cs="Arial" w:eastAsia="Arial" w:hAnsi="Arial"/>
+          <w:sz w:val="22"/>
+          <w:szCs w:val="22"/>
+        </w:rPr>
+        <w:t xml:space="preserve"> beside a verb structure shows its tier.</w:t>
       </w:r>
     </w:p>
     <w:p>

</xml_diff>

<commit_message>
VVs: Topic Vocab + chosen structures row (any mix of Essential/Important/Recognition) with French-only lock; View & Print, tests, Speed Challenge; guides
Co-Authored-By: Claude Sonnet 5.5 <noreply@anthropic.com>
Claude-Session: https://claude.ai/code/session_01PyR4m9qw3VZiECsMbL7sBu
</commit_message>
<xml_diff>
--- a/Word documents/Eton_A_Level_User_Guide.docx
+++ b/Word documents/Eton_A_Level_User_Guide.docx
@@ -18188,7 +18188,7 @@
           <w:sz w:val="22"/>
           <w:szCs w:val="22"/>
         </w:rPr>
-        <w:t>What to practise: three labelled rows, each with its own dropdown. Topic Vocab Only (TV1a, TV1b, TV1c, TV1 Entire up to TV12 Entire) is the topic vocabulary only. Verb Structures Only (VS1a up to VS12 Entire) is the verb structures only, in alphabetical order. Vocab and Verbs together (Michaelmas Trials, Summer Trials, then VV1a up to VV12 Entire) is both. Press a row's button, or change its dropdown, to choose; the highlighted row is the one used, and the number of phrases is shown beside each. TV1 to TV12, VS1 to VS12 and VV1 to VV12 all line up with Topics 1 to 12.</w:t>
+        <w:t>What to practise: four labelled rows, each with its own dropdown. Topic Vocab Only (TV1a, TV1b, TV1c, TV1 Entire up to TV12 Entire) is the topic vocabulary only. Verb Structures Only (VS1a up to VS12 Entire) is the verb structures only, in alphabetical order. Vocab and Verbs together (Michaelmas Trials, Summer Trials, then VV1a up to VV12 Entire) is both. Topic Vocab + chosen structures is one week of topic vocabulary plus whichever of its verb structures you choose (see below). Press a row's button, or change its dropdown, to choose; the highlighted row is the one used, and the number of phrases is shown beside each. TV1 to TV12, VS1 to VS12 and VV1 to VV12 all line up with Topics 1 to 12.</w:t>
       </w:r>
     </w:p>
     <w:p>
@@ -18237,6 +18237,26 @@
           <w:sz w:val="22"/>
           <w:szCs w:val="22"/>
         </w:rPr>
+        <w:t>Topic Vocab + chosen structures: pick a week in the dropdown, then press Essential, Important and/or Recognition under it to add those verb structures to that week's topic vocabulary. You can have any mix, but at least one must stay on. The sets are named to match, for example TV + Essential 3b or TV + Essential + Recognition 3b. The 🔒 French → English only button keeps the whole set (topic vocabulary and structures) in French to English, and Swap will not turn it round; press it to release the lock (🔓 Either direction) and practise either way round. The lock starts on while Recognition is ticked and off otherwise, and it remembers your choice on this device. View &amp; Print and the Speed Challenge list these sets too.</w:t>
+      </w:r>
+    </w:p>
+    <w:p>
+      <w:pPr>
+        <w:pStyle w:val="ListParagraph"/>
+        <w:numPr>
+          <w:ilvl w:val="0"/>
+          <w:numId w:val="2"/>
+        </w:numPr>
+        <w:spacing w:after="60" w:line="276"/>
+      </w:pPr>
+      <w:r>
+        <w:rPr>
+          <w:rFonts w:ascii="Arial" w:cs="Arial" w:eastAsia="Arial" w:hAnsi="Arial"/>
+          <w:b/>
+          <w:bCs/>
+          <w:sz w:val="22"/>
+          <w:szCs w:val="22"/>
+        </w:rPr>
         <w:t>TV1a</w:t>
       </w:r>
       <w:r>
@@ -18263,7 +18283,7 @@
           <w:sz w:val="22"/>
           <w:szCs w:val="22"/>
         </w:rPr>
-        <w:t xml:space="preserve"> is its verb structures, so TV1a and VS1a together make VV1a (the same goes for every set). Your teacher will tell you which sets to learn. 📖 View &amp; Print and the ⚡ Speed Challenge list the same three groups.</w:t>
+        <w:t xml:space="preserve"> is its verb structures, so TV1a and VS1a together make VV1a (the same goes for every set). Your teacher will tell you which sets to learn. 📖 View &amp; Print and the ⚡ Speed Challenge list the same groups.</w:t>
       </w:r>
     </w:p>
     <w:p>

</xml_diff>

<commit_message>
Mix both ways (Off, 50-50, 70-30) in the six vocab apps, with guides
Adds a Mix option under Direction in F Spanish Vocab, IGCSE Vocab Essentials,
IGCSE Vocab and Gr EWs, Essential Phrases, A Level VVs and the Oral Phrase Bank:
drills, Leisure Mode, tests, Spot Tests, Speed Challenge and set links. The
second number is always into English. Recognition phrases stay French -> English
when the padlock is on. Essential Phrases: fixes the Vocabulary iframe srcdoc
cut-off caused by two unescaped quotes. All HTML and Word user guides updated.

Co-Authored-By: Claude Sonnet 5.5 <noreply@anthropic.com>
Claude-Session: https://claude.ai/code/session_012CWWZC1fgkCrSzUumCoAHh
</commit_message>
<xml_diff>
--- a/Word documents/Eton_A_Level_User_Guide.docx
+++ b/Word documents/Eton_A_Level_User_Guide.docx
@@ -1562,6 +1562,12 @@
               </w:rPr>
               <w:t xml:space="preserve"> flips them. Practise both directions.</w:t>
             </w:r>
+            <w:r>
+              <w:rPr>
+                <w:b w:val="0"/>
+              </w:rPr>
+              <w:t xml:space="preserve"> Under Direction, Mix both ways puts both directions in one session. 50–50 gives half the cards each way; 70–30 gives seven in ten from English into the other language and three in ten back into English. Each card shows which way it goes. It starts as Off.</w:t>
+            </w:r>
           </w:p>
         </w:tc>
       </w:tr>
@@ -18393,6 +18399,12 @@
         </w:rPr>
         <w:t xml:space="preserve">.</w:t>
       </w:r>
+      <w:r>
+        <w:rPr>
+          <w:b w:val="0"/>
+        </w:rPr>
+        <w:t xml:space="preserve"> Under Direction, Mix both ways (Off, 50–50 or 70–30) sends some cards into French and some back into English.</w:t>
+      </w:r>
     </w:p>
     <w:p>
       <w:pPr>
@@ -18833,6 +18845,12 @@
           <w:szCs w:val="22"/>
         </w:rPr>
         <w:t xml:space="preserve"> (Level, 5 / 10 / 15 / Custom questions).</w:t>
+      </w:r>
+      <w:r>
+        <w:rPr>
+          <w:b w:val="0"/>
+        </w:rPr>
+        <w:t xml:space="preserve"> Mix both ways (Off, 50–50 or 70–30) is also offered, each card showing its own direction.</w:t>
       </w:r>
     </w:p>
     <w:p>
@@ -20580,6 +20598,26 @@
           <w:szCs w:val="22"/>
         </w:rPr>
         <w:t xml:space="preserve">.</w:t>
+      </w:r>
+    </w:p>
+    <w:p>
+      <w:pPr>
+        <w:pStyle w:val="ListParagraph"/>
+        <w:numPr>
+          <w:ilvl w:val="0"/>
+          <w:numId w:val="2"/>
+        </w:numPr>
+        <w:spacing w:after="60" w:line="276"/>
+      </w:pPr>
+      <w:r>
+        <w:rPr>
+          <w:rFonts w:ascii="Arial" w:cs="Arial" w:eastAsia="Arial" w:hAnsi="Arial"/>
+          <w:b w:val="0"/>
+          <w:bCs/>
+          <w:sz w:val="22"/>
+          <w:szCs w:val="22"/>
+        </w:rPr>
+        <w:t>Mix both ways (under Direction): Off, 50–50 or 70–30. With 70–30, seven in ten cards go from English into the language and three in ten back into English; each card shows its own direction. It works in the drill, Leisure Mode, tests, Spot Tests and the Speed Challenge, and starts as Off each time.</w:t>
       </w:r>
     </w:p>
     <w:p>

</xml_diff>